<commit_message>
Revisione Pattern: Strategy, documentazione
</commit_message>
<xml_diff>
--- a/designPattern/strategy/Strategy.docx
+++ b/designPattern/strategy/Strategy.docx
@@ -47,23 +47,7 @@
           <w:b/>
           <w:bCs/>
         </w:rPr>
-        <w:t>Client/</w:t>
-      </w:r>
-      <w:proofErr w:type="spellStart"/>
-      <w:r>
-        <w:rPr>
-          <w:b/>
-          <w:bCs/>
-        </w:rPr>
-        <w:t>Context</w:t>
-      </w:r>
-      <w:proofErr w:type="spellEnd"/>
-      <w:r>
-        <w:rPr>
-          <w:b/>
-          <w:bCs/>
-        </w:rPr>
-        <w:t xml:space="preserve">: </w:t>
+        <w:t xml:space="preserve">Client/Context: </w:t>
       </w:r>
       <w:r>
         <w:t>esso fornisce il problema da risolvere</w:t>
@@ -96,21 +80,12 @@
           <w:numId w:val="1"/>
         </w:numPr>
       </w:pPr>
-      <w:proofErr w:type="spellStart"/>
       <w:r>
         <w:rPr>
           <w:b/>
           <w:bCs/>
         </w:rPr>
-        <w:t>ConcreteStrategy</w:t>
-      </w:r>
-      <w:proofErr w:type="spellEnd"/>
-      <w:r>
-        <w:rPr>
-          <w:b/>
-          <w:bCs/>
-        </w:rPr>
-        <w:t>:</w:t>
+        <w:t>ConcreteStrategy:</w:t>
       </w:r>
       <w:r>
         <w:t xml:space="preserve"> è la classe concreta che sa svolgere le operazioni di risoluzione</w:t>
@@ -124,69 +99,39 @@
         <w:t>un’aggiunta</w:t>
       </w:r>
       <w:r>
-        <w:t xml:space="preserve"> ostica questo pattern ci aiuta a realizzare due principi fondamentali dell’ingegneria del software, quello di responsabilità singola. Si immagini di dover implementare tanti algoritmi nella stessa classe per la risoluzione di un singolo problema, mischiamo la responsabilità di soluzione con chi espone il caso da risolvere. Aiuta molto nel soddisfacimento del principio open/</w:t>
-      </w:r>
-      <w:proofErr w:type="spellStart"/>
-      <w:r>
-        <w:t>closed</w:t>
-      </w:r>
-      <w:proofErr w:type="spellEnd"/>
-      <w:r>
-        <w:t xml:space="preserve">, infatti il codice può essere aggiornato tranquillamente aggiungendo un’altra classe </w:t>
-      </w:r>
-      <w:proofErr w:type="spellStart"/>
+        <w:t xml:space="preserve"> ostica questo pattern ci aiuta a realizzare due principi fondamentali dell’ingegneria del software, quello di responsabilità singola. Si immagini di dover implementare tanti algoritmi nella stessa classe per la risoluzione di un singolo problema, mischiamo la responsabilità di soluzione con chi espone il caso da risolvere. Aiuta molto nel soddisfacimento del principio open/closed, infatti il codice può essere aggiornato tranquillamente aggiungendo un’altra classe </w:t>
+      </w:r>
       <w:r>
         <w:rPr>
           <w:i/>
           <w:iCs/>
         </w:rPr>
-        <w:t>ConcreteStrategy</w:t>
-      </w:r>
-      <w:proofErr w:type="spellEnd"/>
+        <w:t xml:space="preserve">ConcreteStrategy </w:t>
+      </w:r>
+      <w:r>
+        <w:t>per l’implementazione di un altro algoritmo risolutivo senza modificare codice già esistente.</w:t>
+      </w:r>
+    </w:p>
+    <w:p>
+      <w:r>
+        <w:t xml:space="preserve">Prendiamo come esempio una classe </w:t>
+      </w:r>
       <w:r>
         <w:rPr>
           <w:i/>
           <w:iCs/>
         </w:rPr>
-        <w:t xml:space="preserve"> </w:t>
-      </w:r>
-      <w:r>
-        <w:t>per l’implementazione di un altro algoritmo risolutivo senza modificare codice già esistente.</w:t>
+        <w:t xml:space="preserve">“PagaCarrello” </w:t>
+      </w:r>
+      <w:r>
+        <w:t>essa rappresenta un carrello di un e-commerce che calcola il valore totale e chiede all’utente di inserire il metodo di pagamento da lui preferito:</w:t>
       </w:r>
     </w:p>
     <w:p>
       <w:r>
-        <w:t xml:space="preserve">Prendiamo come esempio una classe </w:t>
-      </w:r>
-      <w:r>
-        <w:rPr>
-          <w:i/>
-          <w:iCs/>
-        </w:rPr>
-        <w:t>“</w:t>
-      </w:r>
-      <w:proofErr w:type="spellStart"/>
-      <w:r>
-        <w:rPr>
-          <w:i/>
-          <w:iCs/>
-        </w:rPr>
-        <w:t>PagaCarrello</w:t>
-      </w:r>
-      <w:proofErr w:type="spellEnd"/>
-      <w:r>
-        <w:rPr>
-          <w:i/>
-          <w:iCs/>
-        </w:rPr>
-        <w:t xml:space="preserve">” </w:t>
-      </w:r>
-      <w:r>
-        <w:t>essa rappresenta un carrello di un e-commerce che calcola il valore totale e chiede all’utente di inserire il metodo di pagamento da lui preferito:</w:t>
-      </w:r>
-    </w:p>
-    <w:p>
-      <w:r>
+        <w:rPr>
+          <w:noProof/>
+        </w:rPr>
         <w:drawing>
           <wp:anchor distT="0" distB="0" distL="114300" distR="114300" simplePos="0" relativeHeight="251658240" behindDoc="0" locked="0" layoutInCell="1" allowOverlap="1" wp14:anchorId="50EC69C6" wp14:editId="5F683622">
             <wp:simplePos x="0" y="0"/>
@@ -273,6 +218,9 @@
         </w:rPr>
       </w:pPr>
       <w:r>
+        <w:rPr>
+          <w:noProof/>
+        </w:rPr>
         <w:drawing>
           <wp:anchor distT="0" distB="0" distL="114300" distR="114300" simplePos="0" relativeHeight="251659264" behindDoc="0" locked="0" layoutInCell="1" allowOverlap="1" wp14:anchorId="1807CCDA" wp14:editId="300B86D8">
             <wp:simplePos x="0" y="0"/>
@@ -437,6 +385,9 @@
         </w:rPr>
       </w:pPr>
       <w:r>
+        <w:rPr>
+          <w:noProof/>
+        </w:rPr>
         <w:drawing>
           <wp:anchor distT="0" distB="0" distL="114300" distR="114300" simplePos="0" relativeHeight="251661312" behindDoc="0" locked="0" layoutInCell="1" allowOverlap="1" wp14:anchorId="1B12A926" wp14:editId="0A8E7408">
             <wp:simplePos x="0" y="0"/>
@@ -542,85 +493,27 @@
         </w:drawing>
       </w:r>
       <w:r>
-        <w:t xml:space="preserve">A primo impatto si nota subito come il metodo acquista sia diventato più snello e leggibile soprattutto. </w:t>
-      </w:r>
-      <w:proofErr w:type="gramStart"/>
-      <w:r>
-        <w:t>Infatti</w:t>
-      </w:r>
-      <w:proofErr w:type="gramEnd"/>
-      <w:r>
-        <w:t xml:space="preserve"> dopo aver istanziato </w:t>
-      </w:r>
-      <w:r>
-        <w:t xml:space="preserve">un oggetto di tipo </w:t>
-      </w:r>
-      <w:proofErr w:type="spellStart"/>
-      <w:proofErr w:type="gramStart"/>
-      <w:r>
-        <w:t>MetodiPagamento</w:t>
-      </w:r>
-      <w:proofErr w:type="spellEnd"/>
-      <w:proofErr w:type="gramEnd"/>
-      <w:r>
-        <w:t xml:space="preserve"> lasciamo a lui tutto il da farsi per procedere a pagare il nostro carrello. Introduciamo anche un metodo set per impostare il nostro metodo di pagamento preferito a </w:t>
-      </w:r>
-      <w:proofErr w:type="spellStart"/>
-      <w:r>
-        <w:t>RunTime</w:t>
-      </w:r>
-      <w:proofErr w:type="spellEnd"/>
-      <w:r>
-        <w:t xml:space="preserve">. La classe </w:t>
+        <w:t xml:space="preserve">A primo impatto si nota subito come il metodo acquista sia diventato più snello e leggibile soprattutto. Infatti dopo aver istanziato </w:t>
+      </w:r>
+      <w:r>
+        <w:t xml:space="preserve">un oggetto di tipo MetodiPagamento lasciamo a lui tutto il da farsi per procedere a pagare il nostro carrello. Introduciamo anche un metodo set per impostare il nostro metodo di pagamento preferito a RunTime. La classe </w:t>
       </w:r>
       <w:r>
         <w:rPr>
           <w:i/>
           <w:iCs/>
         </w:rPr>
-        <w:t>“</w:t>
-      </w:r>
-      <w:proofErr w:type="spellStart"/>
+        <w:t xml:space="preserve">“PagaCarrello” </w:t>
+      </w:r>
+      <w:r>
+        <w:t xml:space="preserve">non ha più potere su come verrà pagato o su cosa deve richiedere dato che ha delegato tutto all’istanza di </w:t>
+      </w:r>
       <w:r>
         <w:rPr>
           <w:i/>
           <w:iCs/>
         </w:rPr>
-        <w:t>PagaCarrello</w:t>
-      </w:r>
-      <w:proofErr w:type="spellEnd"/>
-      <w:r>
-        <w:rPr>
-          <w:i/>
-          <w:iCs/>
-        </w:rPr>
-        <w:t xml:space="preserve">” </w:t>
-      </w:r>
-      <w:r>
-        <w:t xml:space="preserve">non ha più potere su come verrà pagato o su cosa deve richiedere dato che ha delegato tutto all’istanza di </w:t>
-      </w:r>
-      <w:r>
-        <w:rPr>
-          <w:i/>
-          <w:iCs/>
-        </w:rPr>
-        <w:t>“</w:t>
-      </w:r>
-      <w:proofErr w:type="spellStart"/>
-      <w:r>
-        <w:rPr>
-          <w:i/>
-          <w:iCs/>
-        </w:rPr>
-        <w:t>MetodiPagamento</w:t>
-      </w:r>
-      <w:proofErr w:type="spellEnd"/>
-      <w:r>
-        <w:rPr>
-          <w:i/>
-          <w:iCs/>
-        </w:rPr>
-        <w:t>”</w:t>
+        <w:t>“MetodiPagamento”</w:t>
       </w:r>
       <w:r>
         <w:t xml:space="preserve"> quindi rispettiamo a pieno il principio di responsabilità singola. Nel nostro solito main di test avremo per il suo utilizzo il seguente scenario:</w:t>
@@ -789,6 +682,12 @@
             </a:graphic>
           </wp:inline>
         </w:drawing>
+      </w:r>
+      <w:r>
+        <w:rPr>
+          <w:noProof/>
+        </w:rPr>
+        <w:t>Il prof ha fatto nell’esempio uml il client come contesto.</w:t>
       </w:r>
     </w:p>
     <w:sectPr>

</xml_diff>